<commit_message>
Guía: usar python -m pip en lugar de pip (instalaciones sin pip en PATH)
</commit_message>
<xml_diff>
--- a/guia/Guia_Instalacion_VSCode.docx
+++ b/guia/Guia_Instalacion_VSCode.docx
@@ -1458,7 +1458,7 @@
           <w:b w:val="0"/>
           <w:i w:val="0"/>
         </w:rPr>
-        <w:t>Son cinco librerías. Se instalan con un solo comando en la misma terminal de VS Code del paso anterior:</w:t>
+        <w:t>Son cinco librerías. Se instalan con un solo comando en la misma terminal de VS Code del paso anterior. Se escribe «python -m pip» y no solo «pip»: así funciona aunque Windows no haya registrado el comando pip (pasa con algunas instalaciones).</w:t>
       </w:r>
     </w:p>
     <w:tbl>
@@ -1710,7 +1710,7 @@
                 <w:rFonts w:ascii="Consolas" w:hAnsi="Consolas"/>
                 <w:sz w:val="19"/>
               </w:rPr>
-              <w:t>pip install numpy pandas matplotlib scikit-learn ipykernel</w:t>
+              <w:t>python -m pip install numpy pandas matplotlib scikit-learn ipykernel</w:t>
             </w:r>
           </w:p>
         </w:tc>
@@ -2358,7 +2358,7 @@
               <w:rPr>
                 <w:sz w:val="19"/>
               </w:rPr>
-              <w:t>Mismo problema del PATH</w:t>
+              <w:t>Windows registró python pero no pip (instalaciones con Python Install Manager o sin PATH)</w:t>
             </w:r>
           </w:p>
         </w:tc>
@@ -2372,14 +2372,27 @@
               <w:rPr>
                 <w:sz w:val="19"/>
               </w:rPr>
-              <w:t xml:space="preserve">Usa </w:t>
+              <w:t xml:space="preserve">Escribe siempre </w:t>
             </w:r>
             <w:r>
               <w:rPr>
                 <w:rFonts w:ascii="Consolas" w:hAnsi="Consolas"/>
                 <w:sz w:val="18"/>
               </w:rPr>
-              <w:t>python -m pip install numpy pandas matplotlib scikit-learn ipykernel</w:t>
+              <w:t>python -m pip install …</w:t>
+            </w:r>
+            <w:r>
+              <w:rPr>
+                <w:sz w:val="19"/>
+              </w:rPr>
+              <w:t xml:space="preserve"> en lugar de </w:t>
+            </w:r>
+            <w:r>
+              <w:rPr>
+                <w:rFonts w:ascii="Consolas" w:hAnsi="Consolas"/>
+                <w:sz w:val="18"/>
+              </w:rPr>
+              <w:t>pip install …</w:t>
             </w:r>
           </w:p>
         </w:tc>

</xml_diff>